<commit_message>
Update DSSS detect report with Docker image
</commit_message>
<xml_diff>
--- a/docs/MINH_CHUNG_B22DCAT035_steg-dsss-detect.docx
+++ b/docs/MINH_CHUNG_B22DCAT035_steg-dsss-detect.docx
@@ -254,7 +254,7 @@
     </w:p>
     <w:tbl>
       <w:tblPr>
-        <w:tblW w:w="3524" w:type="dxa"/>
+        <w:tblW w:w="10859" w:type="dxa"/>
         <w:jc w:val="start"/>
         <w:tblInd w:w="0" w:type="dxa"/>
         <w:tblLayout w:type="fixed"/>
@@ -266,14 +266,14 @@
         </w:tblCellMar>
       </w:tblPr>
       <w:tblGrid>
-        <w:gridCol w:w="806"/>
-        <w:gridCol w:w="2718"/>
+        <w:gridCol w:w="1426"/>
+        <w:gridCol w:w="9433"/>
       </w:tblGrid>
       <w:tr>
         <w:trPr/>
         <w:tc>
           <w:tcPr>
-            <w:tcW w:w="806" w:type="dxa"/>
+            <w:tcW w:w="1426" w:type="dxa"/>
             <w:tcBorders/>
             <w:vAlign w:val="center"/>
           </w:tcPr>
@@ -295,7 +295,7 @@
         </w:tc>
         <w:tc>
           <w:tcPr>
-            <w:tcW w:w="2718" w:type="dxa"/>
+            <w:tcW w:w="9433" w:type="dxa"/>
             <w:tcBorders/>
             <w:vAlign w:val="center"/>
           </w:tcPr>
@@ -320,7 +320,7 @@
         <w:trPr/>
         <w:tc>
           <w:tcPr>
-            <w:tcW w:w="806" w:type="dxa"/>
+            <w:tcW w:w="1426" w:type="dxa"/>
             <w:tcBorders/>
             <w:vAlign w:val="center"/>
           </w:tcPr>
@@ -339,7 +339,7 @@
         </w:tc>
         <w:tc>
           <w:tcPr>
-            <w:tcW w:w="2718" w:type="dxa"/>
+            <w:tcW w:w="9433" w:type="dxa"/>
             <w:tcBorders/>
             <w:vAlign w:val="center"/>
           </w:tcPr>
@@ -363,7 +363,7 @@
         <w:trPr/>
         <w:tc>
           <w:tcPr>
-            <w:tcW w:w="806" w:type="dxa"/>
+            <w:tcW w:w="1426" w:type="dxa"/>
             <w:tcBorders/>
             <w:vAlign w:val="center"/>
           </w:tcPr>
@@ -382,7 +382,7 @@
         </w:tc>
         <w:tc>
           <w:tcPr>
-            <w:tcW w:w="2718" w:type="dxa"/>
+            <w:tcW w:w="9433" w:type="dxa"/>
             <w:tcBorders/>
             <w:vAlign w:val="center"/>
           </w:tcPr>
@@ -404,7 +404,7 @@
         <w:trPr/>
         <w:tc>
           <w:tcPr>
-            <w:tcW w:w="806" w:type="dxa"/>
+            <w:tcW w:w="1426" w:type="dxa"/>
             <w:tcBorders/>
             <w:vAlign w:val="center"/>
           </w:tcPr>
@@ -423,7 +423,7 @@
         </w:tc>
         <w:tc>
           <w:tcPr>
-            <w:tcW w:w="2718" w:type="dxa"/>
+            <w:tcW w:w="9433" w:type="dxa"/>
             <w:tcBorders/>
             <w:vAlign w:val="center"/>
           </w:tcPr>
@@ -501,7 +501,7 @@
         <w:trPr/>
         <w:tc>
           <w:tcPr>
-            <w:tcW w:w="806" w:type="dxa"/>
+            <w:tcW w:w="1426" w:type="dxa"/>
             <w:tcBorders/>
             <w:vAlign w:val="center"/>
           </w:tcPr>
@@ -520,7 +520,7 @@
         </w:tc>
         <w:tc>
           <w:tcPr>
-            <w:tcW w:w="2718" w:type="dxa"/>
+            <w:tcW w:w="9433" w:type="dxa"/>
             <w:tcBorders/>
             <w:vAlign w:val="center"/>
           </w:tcPr>
@@ -763,13 +763,73 @@
     </w:p>
     <w:p>
       <w:pPr>
+        <w:pStyle w:val="PreformattedText"/>
+        <w:bidi w:val="0"/>
+        <w:rPr/>
+      </w:pPr>
+      <w:r>
+        <w:rPr/>
+        <w:t>imodule https://raw.githubusercontent.com/bac-ptit/labtainer/main/steg-dsss-detect.tar</w:t>
+      </w:r>
+    </w:p>
+    <w:p>
+      <w:pPr>
+        <w:pStyle w:val="PreformattedText"/>
+        <w:bidi w:val="0"/>
+        <w:rPr/>
+      </w:pPr>
+      <w:r>
+        <w:rPr/>
+        <w:t>docker pull hoangbac2004/steg-dsss-detect.students.student:latest</w:t>
+      </w:r>
+    </w:p>
+    <w:p>
+      <w:pPr>
+        <w:pStyle w:val="PreformattedText"/>
+        <w:bidi w:val="0"/>
+        <w:spacing w:before="0" w:after="283"/>
+        <w:rPr/>
+      </w:pPr>
+      <w:r>
+        <w:rPr/>
+        <w:t>labtainer -r steg-dsss-detect</w:t>
+      </w:r>
+    </w:p>
+    <w:p>
+      <w:pPr>
+        <w:pStyle w:val="BodyTextshot"/>
+        <w:bidi w:val="0"/>
+        <w:rPr/>
+      </w:pPr>
+      <w:r>
+        <w:rPr/>
+        <w:t>&lt;Ảnh&gt;</w:t>
+      </w:r>
+    </w:p>
+    <w:p>
+      <w:pPr>
+        <w:pStyle w:val="Heading2"/>
+        <w:bidi w:val="0"/>
+        <w:rPr/>
+      </w:pPr>
+      <w:r>
+        <w:rPr/>
+        <w:t>5. Các nhiệm vụ của bài thực hành</w:t>
+      </w:r>
+    </w:p>
+    <w:p>
+      <w:pPr>
         <w:pStyle w:val="BodyText"/>
         <w:bidi w:val="0"/>
-        <w:rPr/>
-      </w:pPr>
-      <w:r>
-        <w:rPr/>
-        <w:t>Cài lab qua imodule:</w:t>
+        <w:rPr>
+          <w:b/>
+        </w:rPr>
+      </w:pPr>
+      <w:r>
+        <w:rPr>
+          <w:b/>
+        </w:rPr>
+        <w:t>Nhiệm vụ 1 — Chuẩn bị audio kiểm thử</w:t>
       </w:r>
     </w:p>
     <w:p>
@@ -781,18 +841,67 @@
       </w:pPr>
       <w:r>
         <w:rPr/>
-        <w:t>imodule https://raw.githubusercontent.com/bac-ptit/labtainer/main/steg-dsss-detect.tar</w:t>
+        <w:t>python3 step1_prepare_audio.py</w:t>
+      </w:r>
+    </w:p>
+    <w:p>
+      <w:pPr>
+        <w:pStyle w:val="PreformattedText"/>
+        <w:bidi w:val="0"/>
+        <w:rPr/>
+      </w:pPr>
+      <w:r>
+        <w:rPr/>
+        <w:t>Sample rate : 16000</w:t>
+      </w:r>
+    </w:p>
+    <w:p>
+      <w:pPr>
+        <w:pStyle w:val="PreformattedText"/>
+        <w:bidi w:val="0"/>
+        <w:rPr/>
+      </w:pPr>
+      <w:r>
+        <w:rPr/>
+        <w:t>Duration    : 5.0 s</w:t>
+      </w:r>
+    </w:p>
+    <w:p>
+      <w:pPr>
+        <w:pStyle w:val="PreformattedText"/>
+        <w:bidi w:val="0"/>
+        <w:spacing w:before="0" w:after="283"/>
+        <w:rPr/>
+      </w:pPr>
+      <w:r>
+        <w:rPr/>
+        <w:t>Files written: host.wav, clean_test.wav, stego_test.wav</w:t>
+      </w:r>
+    </w:p>
+    <w:p>
+      <w:pPr>
+        <w:pStyle w:val="BodyTextshot"/>
+        <w:bidi w:val="0"/>
+        <w:rPr/>
+      </w:pPr>
+      <w:r>
+        <w:rPr/>
+        <w:t>&lt;Ảnh&gt;</w:t>
       </w:r>
     </w:p>
     <w:p>
       <w:pPr>
         <w:pStyle w:val="BodyText"/>
         <w:bidi w:val="0"/>
-        <w:rPr/>
-      </w:pPr>
-      <w:r>
-        <w:rPr/>
-        <w:t>Chạy lab:</w:t>
+        <w:rPr>
+          <w:b/>
+        </w:rPr>
+      </w:pPr>
+      <w:r>
+        <w:rPr>
+          <w:b/>
+        </w:rPr>
+        <w:t>Nhiệm vụ 2 — Sinh DSSS signature</w:t>
       </w:r>
     </w:p>
     <w:p>
@@ -804,7 +913,52 @@
       </w:pPr>
       <w:r>
         <w:rPr/>
-        <w:t>labtainer -r steg-dsss-detect</w:t>
+        <w:t>python3 step2_generate_signature.py</w:t>
+      </w:r>
+    </w:p>
+    <w:p>
+      <w:pPr>
+        <w:pStyle w:val="PreformattedText"/>
+        <w:bidi w:val="0"/>
+        <w:rPr/>
+      </w:pPr>
+      <w:r>
+        <w:rPr/>
+        <w:t>Message       : DETECT</w:t>
+      </w:r>
+    </w:p>
+    <w:p>
+      <w:pPr>
+        <w:pStyle w:val="PreformattedText"/>
+        <w:bidi w:val="0"/>
+        <w:rPr/>
+      </w:pPr>
+      <w:r>
+        <w:rPr/>
+        <w:t>Bits          : 48</w:t>
+      </w:r>
+    </w:p>
+    <w:p>
+      <w:pPr>
+        <w:pStyle w:val="PreformattedText"/>
+        <w:bidi w:val="0"/>
+        <w:rPr/>
+      </w:pPr>
+      <w:r>
+        <w:rPr/>
+        <w:t>PN chips/bit  : 16</w:t>
+      </w:r>
+    </w:p>
+    <w:p>
+      <w:pPr>
+        <w:pStyle w:val="PreformattedText"/>
+        <w:bidi w:val="0"/>
+        <w:spacing w:before="0" w:after="283"/>
+        <w:rPr/>
+      </w:pPr>
+      <w:r>
+        <w:rPr/>
+        <w:t>Signature len : 768</w:t>
       </w:r>
     </w:p>
     <w:p>
@@ -820,75 +974,301 @@
     </w:p>
     <w:p>
       <w:pPr>
+        <w:pStyle w:val="BodyText"/>
+        <w:bidi w:val="0"/>
+        <w:rPr>
+          <w:b/>
+        </w:rPr>
+      </w:pPr>
+      <w:r>
+        <w:rPr>
+          <w:b/>
+        </w:rPr>
+        <w:t>Nhiệm vụ 3 — Chạy detector watermark</w:t>
+      </w:r>
+    </w:p>
+    <w:p>
+      <w:pPr>
+        <w:pStyle w:val="PreformattedText"/>
+        <w:bidi w:val="0"/>
+        <w:spacing w:before="0" w:after="283"/>
+        <w:rPr/>
+      </w:pPr>
+      <w:r>
+        <w:rPr/>
+        <w:t>python3 step3_detect_watermark.py</w:t>
+      </w:r>
+    </w:p>
+    <w:p>
+      <w:pPr>
+        <w:pStyle w:val="PreformattedText"/>
+        <w:bidi w:val="0"/>
+        <w:rPr/>
+      </w:pPr>
+      <w:r>
+        <w:rPr/>
+        <w:t>DSSS watermark detection</w:t>
+      </w:r>
+    </w:p>
+    <w:p>
+      <w:pPr>
+        <w:pStyle w:val="PreformattedText"/>
+        <w:bidi w:val="0"/>
+        <w:rPr/>
+      </w:pPr>
+      <w:r>
+        <w:rPr/>
+        <w:t>Threshold: 0.4</w:t>
+      </w:r>
+    </w:p>
+    <w:p>
+      <w:pPr>
+        <w:pStyle w:val="PreformattedText"/>
+        <w:bidi w:val="0"/>
+        <w:rPr/>
+      </w:pPr>
+      <w:r>
+        <w:rPr/>
+        <w:t>clean_test.wav -&gt; CLEAN (score 0.016 at offset 58249)</w:t>
+      </w:r>
+    </w:p>
+    <w:p>
+      <w:pPr>
+        <w:pStyle w:val="PreformattedText"/>
+        <w:bidi w:val="0"/>
+        <w:spacing w:before="0" w:after="283"/>
+        <w:rPr/>
+      </w:pPr>
+      <w:r>
+        <w:rPr/>
+        <w:t>stego_test.wav -&gt; WATERMARK_PRESENT (score 0.970 at offset 2400)</w:t>
+      </w:r>
+    </w:p>
+    <w:p>
+      <w:pPr>
+        <w:pStyle w:val="BodyTextshot"/>
+        <w:bidi w:val="0"/>
+        <w:rPr/>
+      </w:pPr>
+      <w:r>
+        <w:rPr/>
+        <w:t>&lt;Ảnh&gt;</w:t>
+      </w:r>
+    </w:p>
+    <w:p>
+      <w:pPr>
+        <w:pStyle w:val="BodyText"/>
+        <w:bidi w:val="0"/>
+        <w:rPr>
+          <w:b/>
+        </w:rPr>
+      </w:pPr>
+      <w:r>
+        <w:rPr>
+          <w:b/>
+        </w:rPr>
+        <w:t>Nhiệm vụ 4 — Vẽ biểu đồ detection</w:t>
+      </w:r>
+    </w:p>
+    <w:p>
+      <w:pPr>
+        <w:pStyle w:val="PreformattedText"/>
+        <w:bidi w:val="0"/>
+        <w:spacing w:before="0" w:after="283"/>
+        <w:rPr/>
+      </w:pPr>
+      <w:r>
+        <w:rPr/>
+        <w:t>python3 step4_plot_detection.py</w:t>
+      </w:r>
+    </w:p>
+    <w:p>
+      <w:pPr>
+        <w:pStyle w:val="PreformattedText"/>
+        <w:bidi w:val="0"/>
+        <w:spacing w:before="0" w:after="283"/>
+        <w:rPr/>
+      </w:pPr>
+      <w:r>
+        <w:rPr/>
+        <w:t>Detection plots generated.</w:t>
+      </w:r>
+    </w:p>
+    <w:p>
+      <w:pPr>
+        <w:pStyle w:val="BodyTextshot"/>
+        <w:bidi w:val="0"/>
+        <w:rPr/>
+      </w:pPr>
+      <w:r>
+        <w:rPr/>
+        <w:t>&lt;Ảnh&gt;</w:t>
+      </w:r>
+    </w:p>
+    <w:p>
+      <w:pPr>
+        <w:pStyle w:val="BodyText"/>
+        <w:bidi w:val="0"/>
+        <w:rPr>
+          <w:b/>
+        </w:rPr>
+      </w:pPr>
+      <w:r>
+        <w:rPr>
+          <w:b/>
+        </w:rPr>
+        <w:t>Nhiệm vụ 5 — Viết tổng kết kết quả</w:t>
+      </w:r>
+    </w:p>
+    <w:p>
+      <w:pPr>
+        <w:pStyle w:val="PreformattedText"/>
+        <w:bidi w:val="0"/>
+        <w:spacing w:before="0" w:after="283"/>
+        <w:rPr/>
+      </w:pPr>
+      <w:r>
+        <w:rPr/>
+        <w:t>python3 step5_write_summary.py</w:t>
+      </w:r>
+    </w:p>
+    <w:p>
+      <w:pPr>
+        <w:pStyle w:val="PreformattedText"/>
+        <w:bidi w:val="0"/>
+        <w:rPr/>
+      </w:pPr>
+      <w:r>
+        <w:rPr/>
+        <w:t>clean_test.wav,CLEAN,score=0.016433,offset=58249</w:t>
+      </w:r>
+    </w:p>
+    <w:p>
+      <w:pPr>
+        <w:pStyle w:val="PreformattedText"/>
+        <w:bidi w:val="0"/>
+        <w:spacing w:before="0" w:after="283"/>
+        <w:rPr/>
+      </w:pPr>
+      <w:r>
+        <w:rPr/>
+        <w:t>stego_test.wav,WATERMARK_PRESENT,score=0.969627,offset=2400</w:t>
+      </w:r>
+    </w:p>
+    <w:p>
+      <w:pPr>
+        <w:pStyle w:val="BodyTextshot"/>
+        <w:bidi w:val="0"/>
+        <w:rPr/>
+      </w:pPr>
+      <w:r>
+        <w:rPr/>
+        <w:t>&lt;Ảnh&gt;</w:t>
+      </w:r>
+    </w:p>
+    <w:p>
+      <w:pPr>
         <w:pStyle w:val="Heading2"/>
         <w:bidi w:val="0"/>
         <w:rPr/>
       </w:pPr>
       <w:r>
         <w:rPr/>
-        <w:t>5. Các nhiệm vụ của bài thực hành</w:t>
+        <w:t>6. Kiểm tra kết quả bài thực hành</w:t>
+      </w:r>
+    </w:p>
+    <w:p>
+      <w:pPr>
+        <w:pStyle w:val="PreformattedText"/>
+        <w:bidi w:val="0"/>
+        <w:rPr/>
+      </w:pPr>
+      <w:r>
+        <w:rPr/>
+        <w:t>stoplab steg-dsss-detect</w:t>
+      </w:r>
+    </w:p>
+    <w:p>
+      <w:pPr>
+        <w:pStyle w:val="PreformattedText"/>
+        <w:bidi w:val="0"/>
+        <w:spacing w:before="0" w:after="283"/>
+        <w:rPr/>
+      </w:pPr>
+      <w:r>
+        <w:rPr/>
+        <w:t>checkwork steg-dsss-detect</w:t>
       </w:r>
     </w:p>
     <w:p>
       <w:pPr>
         <w:pStyle w:val="BodyText"/>
         <w:bidi w:val="0"/>
+        <w:rPr/>
+      </w:pPr>
+      <w:r>
         <w:rPr>
           <w:b/>
         </w:rPr>
-      </w:pPr>
-      <w:r>
-        <w:rPr>
-          <w:b/>
-        </w:rPr>
-        <w:t>Nhiệm vụ 1 — Chuẩn bị audio kiểm thử</w:t>
-      </w:r>
-    </w:p>
-    <w:p>
-      <w:pPr>
-        <w:pStyle w:val="BodyText"/>
-        <w:bidi w:val="0"/>
-        <w:rPr/>
-      </w:pPr>
-      <w:r>
-        <w:rPr>
-          <w:b/>
-        </w:rPr>
-        <w:t>Mục đích:</w:t>
-      </w:r>
-      <w:r>
-        <w:rPr/>
-        <w:t xml:space="preserve"> Tạo </w:t>
+        <w:t>Kết quả đã kiểm tra:</w:t>
+      </w:r>
+      <w:r>
+        <w:rPr/>
+        <w:t xml:space="preserve"> 5 mục đều hiển thị </w:t>
       </w:r>
       <w:r>
         <w:rPr>
           <w:rStyle w:val="SourceText"/>
         </w:rPr>
-        <w:t>host.wav</w:t>
-      </w:r>
-      <w:r>
-        <w:rPr/>
-        <w:t xml:space="preserve">, </w:t>
-      </w:r>
-      <w:r>
-        <w:rPr>
-          <w:rStyle w:val="SourceText"/>
-        </w:rPr>
-        <w:t>clean_test.wav</w:t>
-      </w:r>
-      <w:r>
-        <w:rPr/>
-        <w:t xml:space="preserve"> và </w:t>
-      </w:r>
-      <w:r>
-        <w:rPr>
-          <w:rStyle w:val="SourceText"/>
-        </w:rPr>
-        <w:t>stego_test.wav</w:t>
-      </w:r>
-      <w:r>
-        <w:rPr/>
-        <w:t xml:space="preserve"> để phục vụ phát hiện watermark.</w:t>
+        <w:t>Y</w:t>
+      </w:r>
+      <w:r>
+        <w:rPr/>
+        <w:t>.</w:t>
+      </w:r>
+    </w:p>
+    <w:p>
+      <w:pPr>
+        <w:pStyle w:val="PreformattedText"/>
+        <w:bidi w:val="0"/>
+        <w:rPr/>
+      </w:pPr>
+      <w:r>
+        <w:rPr/>
+        <w:t>prepare_detection_audio   Y</w:t>
+      </w:r>
+    </w:p>
+    <w:p>
+      <w:pPr>
+        <w:pStyle w:val="PreformattedText"/>
+        <w:bidi w:val="0"/>
+        <w:rPr/>
+      </w:pPr>
+      <w:r>
+        <w:rPr/>
+        <w:t>create_dsss_signature     Y</w:t>
+      </w:r>
+    </w:p>
+    <w:p>
+      <w:pPr>
+        <w:pStyle w:val="PreformattedText"/>
+        <w:bidi w:val="0"/>
+        <w:rPr/>
+      </w:pPr>
+      <w:r>
+        <w:rPr/>
+        <w:t>run_watermark_detector    Y</w:t>
+      </w:r>
+    </w:p>
+    <w:p>
+      <w:pPr>
+        <w:pStyle w:val="PreformattedText"/>
+        <w:bidi w:val="0"/>
+        <w:rPr/>
+      </w:pPr>
+      <w:r>
+        <w:rPr/>
+        <w:t>plot_detection_results    Y</w:t>
       </w:r>
     </w:p>
     <w:p>
@@ -900,610 +1280,7 @@
       </w:pPr>
       <w:r>
         <w:rPr/>
-        <w:t>python3 step1_prepare_audio.py</w:t>
-      </w:r>
-    </w:p>
-    <w:p>
-      <w:pPr>
-        <w:pStyle w:val="BodyText"/>
-        <w:bidi w:val="0"/>
-        <w:rPr>
-          <w:b/>
-        </w:rPr>
-      </w:pPr>
-      <w:r>
-        <w:rPr>
-          <w:b/>
-        </w:rPr>
-        <w:t>Kết quả cần thấy:</w:t>
-      </w:r>
-    </w:p>
-    <w:p>
-      <w:pPr>
-        <w:pStyle w:val="PreformattedText"/>
-        <w:bidi w:val="0"/>
-        <w:rPr/>
-      </w:pPr>
-      <w:r>
-        <w:rPr/>
-        <w:t>Sample rate : 16000</w:t>
-      </w:r>
-    </w:p>
-    <w:p>
-      <w:pPr>
-        <w:pStyle w:val="PreformattedText"/>
-        <w:bidi w:val="0"/>
-        <w:rPr/>
-      </w:pPr>
-      <w:r>
-        <w:rPr/>
-        <w:t>Duration    : 5.0 s</w:t>
-      </w:r>
-    </w:p>
-    <w:p>
-      <w:pPr>
-        <w:pStyle w:val="PreformattedText"/>
-        <w:bidi w:val="0"/>
-        <w:spacing w:before="0" w:after="283"/>
-        <w:rPr/>
-      </w:pPr>
-      <w:r>
-        <w:rPr/>
-        <w:t>Files written: host.wav, clean_test.wav, stego_test.wav</w:t>
-      </w:r>
-    </w:p>
-    <w:p>
-      <w:pPr>
-        <w:pStyle w:val="BodyTextshot"/>
-        <w:bidi w:val="0"/>
-        <w:rPr/>
-      </w:pPr>
-      <w:r>
-        <w:rPr/>
-        <w:t>&lt;Ảnh&gt;</w:t>
-      </w:r>
-    </w:p>
-    <w:p>
-      <w:pPr>
-        <w:pStyle w:val="BodyText"/>
-        <w:bidi w:val="0"/>
-        <w:rPr>
-          <w:b/>
-        </w:rPr>
-      </w:pPr>
-      <w:r>
-        <w:rPr>
-          <w:b/>
-        </w:rPr>
-        <w:t>Nhiệm vụ 2 — Sinh DSSS signature</w:t>
-      </w:r>
-    </w:p>
-    <w:p>
-      <w:pPr>
-        <w:pStyle w:val="BodyText"/>
-        <w:bidi w:val="0"/>
-        <w:rPr/>
-      </w:pPr>
-      <w:r>
-        <w:rPr>
-          <w:b/>
-        </w:rPr>
-        <w:t>Mục đích:</w:t>
-      </w:r>
-      <w:r>
-        <w:rPr/>
-        <w:t xml:space="preserve"> Tạo PN code, message bits và chip sequence dùng làm signature cho detector.</w:t>
-      </w:r>
-    </w:p>
-    <w:p>
-      <w:pPr>
-        <w:pStyle w:val="PreformattedText"/>
-        <w:bidi w:val="0"/>
-        <w:spacing w:before="0" w:after="283"/>
-        <w:rPr/>
-      </w:pPr>
-      <w:r>
-        <w:rPr/>
-        <w:t>python3 step2_generate_signature.py</w:t>
-      </w:r>
-    </w:p>
-    <w:p>
-      <w:pPr>
-        <w:pStyle w:val="BodyText"/>
-        <w:bidi w:val="0"/>
-        <w:rPr>
-          <w:b/>
-        </w:rPr>
-      </w:pPr>
-      <w:r>
-        <w:rPr>
-          <w:b/>
-        </w:rPr>
-        <w:t>Kết quả cần thấy:</w:t>
-      </w:r>
-    </w:p>
-    <w:p>
-      <w:pPr>
-        <w:pStyle w:val="PreformattedText"/>
-        <w:bidi w:val="0"/>
-        <w:rPr/>
-      </w:pPr>
-      <w:r>
-        <w:rPr/>
-        <w:t>Message       : DETECT</w:t>
-      </w:r>
-    </w:p>
-    <w:p>
-      <w:pPr>
-        <w:pStyle w:val="PreformattedText"/>
-        <w:bidi w:val="0"/>
-        <w:rPr/>
-      </w:pPr>
-      <w:r>
-        <w:rPr/>
-        <w:t>Bits          : 48</w:t>
-      </w:r>
-    </w:p>
-    <w:p>
-      <w:pPr>
-        <w:pStyle w:val="PreformattedText"/>
-        <w:bidi w:val="0"/>
-        <w:rPr/>
-      </w:pPr>
-      <w:r>
-        <w:rPr/>
-        <w:t>PN chips/bit  : 16</w:t>
-      </w:r>
-    </w:p>
-    <w:p>
-      <w:pPr>
-        <w:pStyle w:val="PreformattedText"/>
-        <w:bidi w:val="0"/>
-        <w:spacing w:before="0" w:after="283"/>
-        <w:rPr/>
-      </w:pPr>
-      <w:r>
-        <w:rPr/>
-        <w:t>Signature len : 768</w:t>
-      </w:r>
-    </w:p>
-    <w:p>
-      <w:pPr>
-        <w:pStyle w:val="BodyTextshot"/>
-        <w:bidi w:val="0"/>
-        <w:rPr/>
-      </w:pPr>
-      <w:r>
-        <w:rPr/>
-        <w:t>&lt;Ảnh&gt;</w:t>
-      </w:r>
-    </w:p>
-    <w:p>
-      <w:pPr>
-        <w:pStyle w:val="BodyText"/>
-        <w:bidi w:val="0"/>
-        <w:rPr>
-          <w:b/>
-        </w:rPr>
-      </w:pPr>
-      <w:r>
-        <w:rPr>
-          <w:b/>
-        </w:rPr>
-        <w:t>Nhiệm vụ 3 — Chạy detector watermark</w:t>
-      </w:r>
-    </w:p>
-    <w:p>
-      <w:pPr>
-        <w:pStyle w:val="BodyText"/>
-        <w:bidi w:val="0"/>
-        <w:rPr/>
-      </w:pPr>
-      <w:r>
-        <w:rPr>
-          <w:b/>
-        </w:rPr>
-        <w:t>Mục đích:</w:t>
-      </w:r>
-      <w:r>
-        <w:rPr/>
-        <w:t xml:space="preserve"> Tính sliding correlation cho từng file audio và kết luận file nào chứa watermark.</w:t>
-      </w:r>
-    </w:p>
-    <w:p>
-      <w:pPr>
-        <w:pStyle w:val="PreformattedText"/>
-        <w:bidi w:val="0"/>
-        <w:spacing w:before="0" w:after="283"/>
-        <w:rPr/>
-      </w:pPr>
-      <w:r>
-        <w:rPr/>
-        <w:t>python3 step3_detect_watermark.py</w:t>
-      </w:r>
-    </w:p>
-    <w:p>
-      <w:pPr>
-        <w:pStyle w:val="BodyText"/>
-        <w:bidi w:val="0"/>
-        <w:rPr>
-          <w:b/>
-        </w:rPr>
-      </w:pPr>
-      <w:r>
-        <w:rPr>
-          <w:b/>
-        </w:rPr>
-        <w:t>Kết quả cần thấy:</w:t>
-      </w:r>
-    </w:p>
-    <w:p>
-      <w:pPr>
-        <w:pStyle w:val="PreformattedText"/>
-        <w:bidi w:val="0"/>
-        <w:rPr/>
-      </w:pPr>
-      <w:r>
-        <w:rPr/>
-        <w:t>DSSS watermark detection</w:t>
-      </w:r>
-    </w:p>
-    <w:p>
-      <w:pPr>
-        <w:pStyle w:val="PreformattedText"/>
-        <w:bidi w:val="0"/>
-        <w:rPr/>
-      </w:pPr>
-      <w:r>
-        <w:rPr/>
-        <w:t>Threshold: 0.4</w:t>
-      </w:r>
-    </w:p>
-    <w:p>
-      <w:pPr>
-        <w:pStyle w:val="PreformattedText"/>
-        <w:bidi w:val="0"/>
-        <w:rPr/>
-      </w:pPr>
-      <w:r>
-        <w:rPr/>
-        <w:t>clean_test.wav -&gt; CLEAN (score 0.016 at offset 58249)</w:t>
-      </w:r>
-    </w:p>
-    <w:p>
-      <w:pPr>
-        <w:pStyle w:val="PreformattedText"/>
-        <w:bidi w:val="0"/>
-        <w:spacing w:before="0" w:after="283"/>
-        <w:rPr/>
-      </w:pPr>
-      <w:r>
-        <w:rPr/>
-        <w:t>stego_test.wav -&gt; WATERMARK_PRESENT (score 0.970 at offset 2400)</w:t>
-      </w:r>
-    </w:p>
-    <w:p>
-      <w:pPr>
-        <w:pStyle w:val="BodyTextshot"/>
-        <w:bidi w:val="0"/>
-        <w:rPr/>
-      </w:pPr>
-      <w:r>
-        <w:rPr/>
-        <w:t>&lt;Ảnh&gt;</w:t>
-      </w:r>
-    </w:p>
-    <w:p>
-      <w:pPr>
-        <w:pStyle w:val="BodyText"/>
-        <w:bidi w:val="0"/>
-        <w:rPr>
-          <w:b/>
-        </w:rPr>
-      </w:pPr>
-      <w:r>
-        <w:rPr>
-          <w:b/>
-        </w:rPr>
-        <w:t>Nhiệm vụ 4 — Vẽ biểu đồ detection</w:t>
-      </w:r>
-    </w:p>
-    <w:p>
-      <w:pPr>
-        <w:pStyle w:val="BodyText"/>
-        <w:bidi w:val="0"/>
-        <w:rPr/>
-      </w:pPr>
-      <w:r>
-        <w:rPr>
-          <w:b/>
-        </w:rPr>
-        <w:t>Mục đích:</w:t>
-      </w:r>
-      <w:r>
-        <w:rPr/>
-        <w:t xml:space="preserve"> Trực quan hóa waveform, DSSS signature, peak score và correlation trace.</w:t>
-      </w:r>
-    </w:p>
-    <w:p>
-      <w:pPr>
-        <w:pStyle w:val="PreformattedText"/>
-        <w:bidi w:val="0"/>
-        <w:spacing w:before="0" w:after="283"/>
-        <w:rPr/>
-      </w:pPr>
-      <w:r>
-        <w:rPr/>
-        <w:t>python3 step4_plot_detection.py</w:t>
-      </w:r>
-    </w:p>
-    <w:p>
-      <w:pPr>
-        <w:pStyle w:val="BodyText"/>
-        <w:bidi w:val="0"/>
-        <w:rPr>
-          <w:b/>
-        </w:rPr>
-      </w:pPr>
-      <w:r>
-        <w:rPr>
-          <w:b/>
-        </w:rPr>
-        <w:t>Kết quả cần thấy:</w:t>
-      </w:r>
-    </w:p>
-    <w:p>
-      <w:pPr>
-        <w:pStyle w:val="PreformattedText"/>
-        <w:bidi w:val="0"/>
-        <w:spacing w:before="0" w:after="283"/>
-        <w:rPr/>
-      </w:pPr>
-      <w:r>
-        <w:rPr/>
-        <w:t>Detection plots generated.</w:t>
-      </w:r>
-    </w:p>
-    <w:p>
-      <w:pPr>
-        <w:pStyle w:val="BodyTextshot"/>
-        <w:bidi w:val="0"/>
-        <w:rPr/>
-      </w:pPr>
-      <w:r>
-        <w:rPr/>
-        <w:t>&lt;Ảnh&gt;</w:t>
-      </w:r>
-    </w:p>
-    <w:p>
-      <w:pPr>
-        <w:pStyle w:val="BodyText"/>
-        <w:bidi w:val="0"/>
-        <w:rPr>
-          <w:b/>
-        </w:rPr>
-      </w:pPr>
-      <w:r>
-        <w:rPr>
-          <w:b/>
-        </w:rPr>
-        <w:t>Nhiệm vụ 5 — Viết tổng kết kết quả</w:t>
-      </w:r>
-    </w:p>
-    <w:p>
-      <w:pPr>
-        <w:pStyle w:val="BodyText"/>
-        <w:bidi w:val="0"/>
-        <w:rPr/>
-      </w:pPr>
-      <w:r>
-        <w:rPr>
-          <w:b/>
-        </w:rPr>
-        <w:t>Mục đích:</w:t>
-      </w:r>
-      <w:r>
-        <w:rPr/>
-        <w:t xml:space="preserve"> Tạo file tổng kết chứa score, ngưỡng và quyết định phát hiện.</w:t>
-      </w:r>
-    </w:p>
-    <w:p>
-      <w:pPr>
-        <w:pStyle w:val="PreformattedText"/>
-        <w:bidi w:val="0"/>
-        <w:spacing w:before="0" w:after="283"/>
-        <w:rPr/>
-      </w:pPr>
-      <w:r>
-        <w:rPr/>
-        <w:t>python3 step5_write_summary.py</w:t>
-      </w:r>
-    </w:p>
-    <w:p>
-      <w:pPr>
-        <w:pStyle w:val="BodyText"/>
-        <w:bidi w:val="0"/>
-        <w:rPr>
-          <w:b/>
-        </w:rPr>
-      </w:pPr>
-      <w:r>
-        <w:rPr>
-          <w:b/>
-        </w:rPr>
-        <w:t>Kết quả cần thấy:</w:t>
-      </w:r>
-    </w:p>
-    <w:p>
-      <w:pPr>
-        <w:pStyle w:val="PreformattedText"/>
-        <w:bidi w:val="0"/>
-        <w:rPr/>
-      </w:pPr>
-      <w:r>
-        <w:rPr/>
-        <w:t>clean_test.wav,CLEAN,score=0.016433,offset=58249</w:t>
-      </w:r>
-    </w:p>
-    <w:p>
-      <w:pPr>
-        <w:pStyle w:val="PreformattedText"/>
-        <w:bidi w:val="0"/>
-        <w:spacing w:before="0" w:after="283"/>
-        <w:rPr/>
-      </w:pPr>
-      <w:r>
-        <w:rPr/>
-        <w:t>stego_test.wav,WATERMARK_PRESENT,score=0.969627,offset=2400</w:t>
-      </w:r>
-    </w:p>
-    <w:p>
-      <w:pPr>
-        <w:pStyle w:val="BodyTextshot"/>
-        <w:bidi w:val="0"/>
-        <w:rPr/>
-      </w:pPr>
-      <w:r>
-        <w:rPr/>
-        <w:t>&lt;Ảnh&gt;</w:t>
-      </w:r>
-    </w:p>
-    <w:p>
-      <w:pPr>
-        <w:pStyle w:val="Heading2"/>
-        <w:bidi w:val="0"/>
-        <w:rPr/>
-      </w:pPr>
-      <w:r>
-        <w:rPr/>
-        <w:t>6. Kiểm tra kết quả bài thực hành</w:t>
-      </w:r>
-    </w:p>
-    <w:p>
-      <w:pPr>
-        <w:pStyle w:val="BodyText"/>
-        <w:bidi w:val="0"/>
-        <w:rPr/>
-      </w:pPr>
-      <w:r>
-        <w:rPr/>
-        <w:t xml:space="preserve">Trên terminal </w:t>
-      </w:r>
-      <w:r>
-        <w:rPr>
-          <w:rStyle w:val="SourceText"/>
-        </w:rPr>
-        <w:t>student@ubuntu</w:t>
-      </w:r>
-      <w:r>
-        <w:rPr/>
-        <w:t>, chạy:</w:t>
-      </w:r>
-    </w:p>
-    <w:p>
-      <w:pPr>
-        <w:pStyle w:val="PreformattedText"/>
-        <w:bidi w:val="0"/>
-        <w:rPr/>
-      </w:pPr>
-      <w:r>
-        <w:rPr/>
-        <w:t>stoplab steg-dsss-detect</w:t>
-      </w:r>
-    </w:p>
-    <w:p>
-      <w:pPr>
-        <w:pStyle w:val="PreformattedText"/>
-        <w:bidi w:val="0"/>
-        <w:spacing w:before="0" w:after="283"/>
-        <w:rPr/>
-      </w:pPr>
-      <w:r>
-        <w:rPr/>
-        <w:t>checkwork steg-dsss-detect</w:t>
-      </w:r>
-    </w:p>
-    <w:p>
-      <w:pPr>
-        <w:pStyle w:val="BodyText"/>
-        <w:bidi w:val="0"/>
-        <w:rPr/>
-      </w:pPr>
-      <w:r>
-        <w:rPr>
-          <w:b/>
-        </w:rPr>
-        <w:t>Kết quả kỳ vọng:</w:t>
-      </w:r>
-      <w:r>
-        <w:rPr/>
-        <w:t xml:space="preserve"> 5 mục đều hiển thị </w:t>
-      </w:r>
-      <w:r>
-        <w:rPr>
-          <w:rStyle w:val="SourceText"/>
-        </w:rPr>
-        <w:t>Y</w:t>
-      </w:r>
-      <w:r>
-        <w:rPr/>
-        <w:t>.</w:t>
-      </w:r>
-    </w:p>
-    <w:p>
-      <w:pPr>
-        <w:pStyle w:val="PreformattedText"/>
-        <w:bidi w:val="0"/>
-        <w:rPr/>
-      </w:pPr>
-      <w:r>
-        <w:rPr/>
-        <w:t>prepare_detection_audio</w:t>
-      </w:r>
-    </w:p>
-    <w:p>
-      <w:pPr>
-        <w:pStyle w:val="PreformattedText"/>
-        <w:bidi w:val="0"/>
-        <w:rPr/>
-      </w:pPr>
-      <w:r>
-        <w:rPr/>
-        <w:t>create_dsss_signature</w:t>
-      </w:r>
-    </w:p>
-    <w:p>
-      <w:pPr>
-        <w:pStyle w:val="PreformattedText"/>
-        <w:bidi w:val="0"/>
-        <w:rPr/>
-      </w:pPr>
-      <w:r>
-        <w:rPr/>
-        <w:t>run_watermark_detector</w:t>
-      </w:r>
-    </w:p>
-    <w:p>
-      <w:pPr>
-        <w:pStyle w:val="PreformattedText"/>
-        <w:bidi w:val="0"/>
-        <w:rPr/>
-      </w:pPr>
-      <w:r>
-        <w:rPr/>
-        <w:t>plot_detection_results</w:t>
-      </w:r>
-    </w:p>
-    <w:p>
-      <w:pPr>
-        <w:pStyle w:val="PreformattedText"/>
-        <w:bidi w:val="0"/>
-        <w:spacing w:before="0" w:after="283"/>
-        <w:rPr/>
-      </w:pPr>
-      <w:r>
-        <w:rPr/>
-        <w:t>write_detection_summary</w:t>
+        <w:t>write_detection_summary   Y</w:t>
       </w:r>
     </w:p>
     <w:p>
@@ -1530,7 +1307,7 @@
     </w:p>
     <w:tbl>
       <w:tblPr>
-        <w:tblW w:w="3992" w:type="dxa"/>
+        <w:tblW w:w="11327" w:type="dxa"/>
         <w:jc w:val="start"/>
         <w:tblInd w:w="0" w:type="dxa"/>
         <w:tblLayout w:type="fixed"/>
@@ -1543,7 +1320,7 @@
       </w:tblPr>
       <w:tblGrid>
         <w:gridCol w:w="961"/>
-        <w:gridCol w:w="3031"/>
+        <w:gridCol w:w="10366"/>
       </w:tblGrid>
       <w:tr>
         <w:trPr/>
@@ -1571,7 +1348,7 @@
         </w:tc>
         <w:tc>
           <w:tcPr>
-            <w:tcW w:w="3031" w:type="dxa"/>
+            <w:tcW w:w="10366" w:type="dxa"/>
             <w:tcBorders/>
             <w:vAlign w:val="center"/>
           </w:tcPr>
@@ -1609,13 +1386,99 @@
             </w:pPr>
             <w:r>
               <w:rPr/>
+              <w:t>Docker image</w:t>
+            </w:r>
+          </w:p>
+        </w:tc>
+        <w:tc>
+          <w:tcPr>
+            <w:tcW w:w="10366" w:type="dxa"/>
+            <w:tcBorders/>
+            <w:vAlign w:val="center"/>
+          </w:tcPr>
+          <w:p>
+            <w:pPr>
+              <w:pStyle w:val="TableContents"/>
+              <w:bidi w:val="0"/>
+              <w:spacing w:before="0" w:after="283"/>
+              <w:rPr/>
+            </w:pPr>
+            <w:r>
+              <w:rPr>
+                <w:rStyle w:val="SourceText"/>
+              </w:rPr>
+              <w:t>hoangbac2004/steg-dsss-detect.students.student:latest</w:t>
+            </w:r>
+          </w:p>
+        </w:tc>
+      </w:tr>
+      <w:tr>
+        <w:trPr/>
+        <w:tc>
+          <w:tcPr>
+            <w:tcW w:w="961" w:type="dxa"/>
+            <w:tcBorders/>
+            <w:vAlign w:val="center"/>
+          </w:tcPr>
+          <w:p>
+            <w:pPr>
+              <w:pStyle w:val="TableContents"/>
+              <w:bidi w:val="0"/>
+              <w:spacing w:before="0" w:after="283"/>
+              <w:rPr/>
+            </w:pPr>
+            <w:r>
+              <w:rPr/>
+              <w:t>Docker digest</w:t>
+            </w:r>
+          </w:p>
+        </w:tc>
+        <w:tc>
+          <w:tcPr>
+            <w:tcW w:w="10366" w:type="dxa"/>
+            <w:tcBorders/>
+            <w:vAlign w:val="center"/>
+          </w:tcPr>
+          <w:p>
+            <w:pPr>
+              <w:pStyle w:val="TableContents"/>
+              <w:bidi w:val="0"/>
+              <w:spacing w:before="0" w:after="283"/>
+              <w:rPr/>
+            </w:pPr>
+            <w:r>
+              <w:rPr>
+                <w:rStyle w:val="SourceText"/>
+              </w:rPr>
+              <w:t>sha256:8019b6d1b411ee985cd2c86ea818a2eacb38de433c2396a046d875de6d4322aa</w:t>
+            </w:r>
+          </w:p>
+        </w:tc>
+      </w:tr>
+      <w:tr>
+        <w:trPr/>
+        <w:tc>
+          <w:tcPr>
+            <w:tcW w:w="961" w:type="dxa"/>
+            <w:tcBorders/>
+            <w:vAlign w:val="center"/>
+          </w:tcPr>
+          <w:p>
+            <w:pPr>
+              <w:pStyle w:val="TableContents"/>
+              <w:bidi w:val="0"/>
+              <w:spacing w:before="0" w:after="283"/>
+              <w:rPr/>
+            </w:pPr>
+            <w:r>
+              <w:rPr/>
               <w:t>Imodule</w:t>
             </w:r>
           </w:p>
         </w:tc>
         <w:tc>
           <w:tcPr>
-            <w:tcW w:w="3031" w:type="dxa"/>
+            <w:tcW w:w="10366" w:type="dxa"/>
             <w:tcBorders/>
             <w:vAlign w:val="center"/>
           </w:tcPr>
@@ -1652,56 +1515,13 @@
             </w:pPr>
             <w:r>
               <w:rPr/>
-              <w:t>Thông điệp phát hiện</w:t>
-            </w:r>
-          </w:p>
-        </w:tc>
-        <w:tc>
-          <w:tcPr>
-            <w:tcW w:w="3031" w:type="dxa"/>
-            <w:tcBorders/>
-            <w:vAlign w:val="center"/>
-          </w:tcPr>
-          <w:p>
-            <w:pPr>
-              <w:pStyle w:val="TableContents"/>
-              <w:bidi w:val="0"/>
-              <w:spacing w:before="0" w:after="283"/>
-              <w:rPr/>
-            </w:pPr>
-            <w:r>
-              <w:rPr>
-                <w:rStyle w:val="SourceText"/>
-              </w:rPr>
-              <w:t>stego_test.wav,WATERMARK_PRESENT</w:t>
-            </w:r>
-          </w:p>
-        </w:tc>
-      </w:tr>
-      <w:tr>
-        <w:trPr/>
-        <w:tc>
-          <w:tcPr>
-            <w:tcW w:w="961" w:type="dxa"/>
-            <w:tcBorders/>
-            <w:vAlign w:val="center"/>
-          </w:tcPr>
-          <w:p>
-            <w:pPr>
-              <w:pStyle w:val="TableContents"/>
-              <w:bidi w:val="0"/>
-              <w:spacing w:before="0" w:after="283"/>
-              <w:rPr/>
-            </w:pPr>
-            <w:r>
-              <w:rPr/>
               <w:t>Pregrade</w:t>
             </w:r>
           </w:p>
         </w:tc>
         <w:tc>
           <w:tcPr>
-            <w:tcW w:w="3031" w:type="dxa"/>
+            <w:tcW w:w="10366" w:type="dxa"/>
             <w:tcBorders/>
             <w:vAlign w:val="center"/>
           </w:tcPr>
@@ -1744,7 +1564,7 @@
         </w:tc>
         <w:tc>
           <w:tcPr>
-            <w:tcW w:w="3031" w:type="dxa"/>
+            <w:tcW w:w="10366" w:type="dxa"/>
             <w:tcBorders/>
             <w:vAlign w:val="center"/>
           </w:tcPr>

</xml_diff>